<commit_message>
Update audio sources for "I Can't Get Enough" and "Life Lines" in music.html
</commit_message>
<xml_diff>
--- a/A&TDC Songs (1).docx
+++ b/A&TDC Songs (1).docx
@@ -1985,13 +1985,7 @@
         <w:rPr>
           <w:b/>
         </w:rPr>
-        <w:t xml:space="preserve">Chorus x </w:t>
-      </w:r>
-      <w:r>
-        <w:rPr>
-          <w:b/>
-        </w:rPr>
-        <w:t>2</w:t>
+        <w:t>Chorus x 2</w:t>
       </w:r>
     </w:p>
     <w:p>
@@ -2437,7 +2431,19 @@
       </w:pPr>
       <w:r>
         <w:rPr/>
-        <w:t>And with a raised right hand she swares</w:t>
+        <w:t>And with a raised right hand she sw</w:t>
+      </w:r>
+      <w:r>
+        <w:rPr/>
+        <w:t>ea</w:t>
+      </w:r>
+      <w:r>
+        <w:rPr/>
+        <w:t>r</w:t>
+      </w:r>
+      <w:r>
+        <w:rPr/>
+        <w:t>s</w:t>
       </w:r>
     </w:p>
     <w:p>
@@ -6478,8 +6484,7 @@
       </w:pPr>
       <w:r>
         <w:rPr>
-          <w:sz w:val="20"/>
-          <w:szCs w:val="20"/>
+          <w:b/>
         </w:rPr>
       </w:r>
     </w:p>
@@ -6512,14 +6517,7 @@
           <w:sz w:val="20"/>
           <w:szCs w:val="20"/>
         </w:rPr>
-        <w:t>It won’t be long before it’s min</w:t>
-      </w:r>
-      <w:r>
-        <w:rPr>
-          <w:sz w:val="20"/>
-          <w:szCs w:val="20"/>
-        </w:rPr>
-        <w:t>e</w:t>
+        <w:t>It won’t be long before it’s mine</w:t>
       </w:r>
     </w:p>
     <w:p>
@@ -6666,8 +6664,7 @@
       </w:pPr>
       <w:r>
         <w:rPr>
-          <w:sz w:val="20"/>
-          <w:szCs w:val="20"/>
+          <w:b/>
         </w:rPr>
       </w:r>
     </w:p>
@@ -7220,19 +7217,23 @@
         </w:rPr>
       </w:pPr>
       <w:r>
-        <w:rPr/>
-      </w:r>
-    </w:p>
-    <w:p>
-      <w:pPr>
-        <w:pStyle w:val="Normal"/>
-        <w:rPr>
-          <w:b/>
-          <w:b/>
-        </w:rPr>
-      </w:pPr>
-      <w:r>
-        <w:rPr/>
+        <w:rPr>
+          <w:b/>
+        </w:rPr>
+      </w:r>
+    </w:p>
+    <w:p>
+      <w:pPr>
+        <w:pStyle w:val="Normal"/>
+        <w:rPr>
+          <w:b/>
+          <w:b/>
+        </w:rPr>
+      </w:pPr>
+      <w:r>
+        <w:rPr>
+          <w:b/>
+        </w:rPr>
       </w:r>
     </w:p>
     <w:p>
@@ -9562,6 +9563,7 @@
     <w:qFormat/>
     <w:pPr>
       <w:widowControl/>
+      <w:suppressAutoHyphens w:val="true"/>
       <w:bidi w:val="0"/>
       <w:spacing w:before="0" w:after="0"/>
       <w:jc w:val="left"/>

</xml_diff>